<commit_message>
Fix model variant table in foundation model doc (v0.1.3)
Keural-Base (mid): embed_dim 512→768, Depth 12→24, Heads 8→12, Params 250M→~183M
Keural-Large (future): embed_dim 768→1024, Depth 24→48, Heads 12→16
Values now match phase2_mid.json and phase3_commercial.json exactly.

Co-Authored-By: Claude Sonnet 4.6 <noreply@anthropic.com>
</commit_message>
<xml_diff>
--- a/keural_foundation_model_v.0.docx
+++ b/keural_foundation_model_v.0.docx
@@ -6713,7 +6713,7 @@
               <w:rPr>
                 <w:rFonts w:ascii="Times New Roman" w:hAnsi="Times New Roman" w:cs="Times New Roman"/>
               </w:rPr>
-              <w:t>512</w:t>
+              <w:t>768</w:t>
             </w:r>
           </w:p>
         </w:tc>
@@ -6744,7 +6744,7 @@
               <w:rPr>
                 <w:rFonts w:ascii="Times New Roman" w:hAnsi="Times New Roman" w:cs="Times New Roman"/>
               </w:rPr>
-              <w:t>12</w:t>
+              <w:t>24</w:t>
             </w:r>
           </w:p>
         </w:tc>
@@ -6775,7 +6775,7 @@
               <w:rPr>
                 <w:rFonts w:ascii="Times New Roman" w:hAnsi="Times New Roman" w:cs="Times New Roman"/>
               </w:rPr>
-              <w:t>8</w:t>
+              <w:t>12</w:t>
             </w:r>
           </w:p>
         </w:tc>
@@ -6806,7 +6806,7 @@
               <w:rPr>
                 <w:rFonts w:ascii="Times New Roman" w:hAnsi="Times New Roman" w:cs="Times New Roman"/>
               </w:rPr>
-              <w:t>250M</w:t>
+              <w:t>~183M</w:t>
             </w:r>
           </w:p>
         </w:tc>
@@ -6870,7 +6870,7 @@
               <w:rPr>
                 <w:rFonts w:ascii="Times New Roman" w:hAnsi="Times New Roman" w:cs="Times New Roman"/>
               </w:rPr>
-              <w:t>768</w:t>
+              <w:t>1024</w:t>
             </w:r>
           </w:p>
         </w:tc>
@@ -6901,7 +6901,7 @@
               <w:rPr>
                 <w:rFonts w:ascii="Times New Roman" w:hAnsi="Times New Roman" w:cs="Times New Roman"/>
               </w:rPr>
-              <w:t>24</w:t>
+              <w:t>48</w:t>
             </w:r>
           </w:p>
         </w:tc>
@@ -6932,7 +6932,7 @@
               <w:rPr>
                 <w:rFonts w:ascii="Times New Roman" w:hAnsi="Times New Roman" w:cs="Times New Roman"/>
               </w:rPr>
-              <w:t>12</w:t>
+              <w:t>16</w:t>
             </w:r>
           </w:p>
         </w:tc>

</xml_diff>